<commit_message>
Condense project plan while retaining all information
</commit_message>
<xml_diff>
--- a/Documents/ProjectPlan_400A_Charger.docx
+++ b/Documents/ProjectPlan_400A_Charger.docx
@@ -10,7 +10,7 @@
       <w:r>
         <w:rPr>
           <w:b/>
-          <w:sz w:val="56"/>
+          <w:sz w:val="52"/>
         </w:rPr>
         <w:t>e-PU10 400A AC/DC Charger</w:t>
       </w:r>
@@ -22,12 +22,11 @@
       <w:r>
         <w:rPr>
           <w:b/>
-          <w:sz w:val="36"/>
+          <w:sz w:val="32"/>
         </w:rPr>
         <w:t>Project plan</w:t>
       </w:r>
     </w:p>
-    <w:p/>
     <w:p/>
     <w:tbl>
       <w:tblPr>
@@ -128,7 +127,7 @@
           <w:p>
             <w:r/>
             <w:r>
-              <w:t>400A AC/DC Charger (battery charger) for e-PU10 BESS</w:t>
+              <w:t>400A AC/DC Charger for e-PU10 BESS</w:t>
             </w:r>
           </w:p>
         </w:tc>
@@ -165,7 +164,7 @@
           <w:p>
             <w:r/>
             <w:r>
-              <w:t>Kickoff date</w:t>
+              <w:t>Kickoff</w:t>
             </w:r>
           </w:p>
         </w:tc>
@@ -222,17 +221,7 @@
     </w:p>
     <w:p>
       <w:r>
-        <w:t>The 400A AC/DC Charger project focuses on the development of a series-production ready battery charger option for the e-PU10 Battery Energy Storage System (BESS). The charger provides a galvanically isolated AC to DC charging path for the e-PU10 main battery (600 – 800 VDC) at a rated AC input of 400 A through a single Powerlock set.</w:t>
-      </w:r>
-    </w:p>
-    <w:p>
-      <w:r>
-        <w:t>The development is driven by a direct client request for higher charging power on the e-PU10 platform, with strict requirements on reliability, serviceability, EMC behaviour and integration with the existing microgrid architecture. The product shall be ready for series production before November 2026 in order to align with the e-PU10V2 release.</w:t>
-      </w:r>
-    </w:p>
-    <w:p>
-      <w:r>
-        <w:t>This document defines the scope, deliverables, planning, governance and acceptance criteria for the project. The plan follows the VDL TRL-based execution model and is tailored to the limited duration and well-bounded scope of this development.</w:t>
+        <w:t>This document defines the scope, deliverables, planning, governance and acceptance criteria for the development of a series-production-ready 400A AC/DC charger option for the e-PU10 BESS. The charger provides a galvanically isolated AC→DC path for the e-PU10 main battery (600–800 VDC) via a single 400A Powerlock set, driven by client demand for higher charging power. The product must be release-ready before November 2026 to align with the e-PU10V2 launch. Execution follows the VDL TRL-based model, tailored to the limited duration of this development.</w:t>
       </w:r>
     </w:p>
     <w:p>
@@ -240,7 +229,7 @@
         <w:pStyle w:val="Heading2"/>
       </w:pPr>
       <w:r>
-        <w:t>Abbreviations and Definitions</w:t>
+        <w:t>Abbreviations</w:t>
       </w:r>
     </w:p>
     <w:tbl>
@@ -264,7 +253,7 @@
               <w:rPr>
                 <w:b/>
               </w:rPr>
-              <w:t>Abbreviation</w:t>
+              <w:t>Abbr.</w:t>
             </w:r>
           </w:p>
         </w:tc>
@@ -291,7 +280,7 @@
           <w:p>
             <w:r/>
             <w:r>
-              <w:t>AC</w:t>
+              <w:t>AC / DC</w:t>
             </w:r>
           </w:p>
         </w:tc>
@@ -302,7 +291,7 @@
           <w:p>
             <w:r/>
             <w:r>
-              <w:t>Alternating Current</w:t>
+              <w:t>Alternating / Direct Current</w:t>
             </w:r>
           </w:p>
         </w:tc>
@@ -315,7 +304,7 @@
           <w:p>
             <w:r/>
             <w:r>
-              <w:t>DC</w:t>
+              <w:t>BESS</w:t>
             </w:r>
           </w:p>
         </w:tc>
@@ -326,7 +315,7 @@
           <w:p>
             <w:r/>
             <w:r>
-              <w:t>Direct Current</w:t>
+              <w:t>Battery Energy Storage System</w:t>
             </w:r>
           </w:p>
         </w:tc>
@@ -339,7 +328,7 @@
           <w:p>
             <w:r/>
             <w:r>
-              <w:t>BESS</w:t>
+              <w:t>CE</w:t>
             </w:r>
           </w:p>
         </w:tc>
@@ -350,7 +339,7 @@
           <w:p>
             <w:r/>
             <w:r>
-              <w:t>Battery Energy Storage System</w:t>
+              <w:t>Conformité Européenne</w:t>
             </w:r>
           </w:p>
         </w:tc>
@@ -363,7 +352,7 @@
           <w:p>
             <w:r/>
             <w:r>
-              <w:t>CE</w:t>
+              <w:t>EMC</w:t>
             </w:r>
           </w:p>
         </w:tc>
@@ -374,7 +363,7 @@
           <w:p>
             <w:r/>
             <w:r>
-              <w:t>Conformité Européenne</w:t>
+              <w:t>Electromagnetic Compatibility</w:t>
             </w:r>
           </w:p>
         </w:tc>
@@ -387,7 +376,7 @@
           <w:p>
             <w:r/>
             <w:r>
-              <w:t>EMC</w:t>
+              <w:t>PE</w:t>
             </w:r>
           </w:p>
         </w:tc>
@@ -398,7 +387,7 @@
           <w:p>
             <w:r/>
             <w:r>
-              <w:t>Electromagnetic Compatibility</w:t>
+              <w:t>Protective Earth</w:t>
             </w:r>
           </w:p>
         </w:tc>
@@ -411,7 +400,7 @@
           <w:p>
             <w:r/>
             <w:r>
-              <w:t>PE</w:t>
+              <w:t>PFC</w:t>
             </w:r>
           </w:p>
         </w:tc>
@@ -422,7 +411,7 @@
           <w:p>
             <w:r/>
             <w:r>
-              <w:t>Protective Earth</w:t>
+              <w:t>Power Factor Correction</w:t>
             </w:r>
           </w:p>
         </w:tc>
@@ -435,7 +424,7 @@
           <w:p>
             <w:r/>
             <w:r>
-              <w:t>PFC</w:t>
+              <w:t>TRL</w:t>
             </w:r>
           </w:p>
         </w:tc>
@@ -446,55 +435,7 @@
           <w:p>
             <w:r/>
             <w:r>
-              <w:t>Power Factor Correction</w:t>
-            </w:r>
-          </w:p>
-        </w:tc>
-      </w:tr>
-      <w:tr>
-        <w:tc>
-          <w:tcPr>
-            <w:tcW w:type="dxa" w:w="4513"/>
-          </w:tcPr>
-          <w:p>
-            <w:r/>
-            <w:r>
-              <w:t>TRL</w:t>
-            </w:r>
-          </w:p>
-        </w:tc>
-        <w:tc>
-          <w:tcPr>
-            <w:tcW w:type="dxa" w:w="4513"/>
-          </w:tcPr>
-          <w:p>
-            <w:r/>
-            <w:r>
               <w:t>Technology Readiness Level</w:t>
-            </w:r>
-          </w:p>
-        </w:tc>
-      </w:tr>
-      <w:tr>
-        <w:tc>
-          <w:tcPr>
-            <w:tcW w:type="dxa" w:w="4513"/>
-          </w:tcPr>
-          <w:p>
-            <w:r/>
-            <w:r>
-              <w:t>VDC</w:t>
-            </w:r>
-          </w:p>
-        </w:tc>
-        <w:tc>
-          <w:tcPr>
-            <w:tcW w:type="dxa" w:w="4513"/>
-          </w:tcPr>
-          <w:p>
-            <w:r/>
-            <w:r>
-              <w:t>Volts Direct Current</w:t>
             </w:r>
           </w:p>
         </w:tc>
@@ -506,12 +447,63 @@
         <w:pStyle w:val="Heading2"/>
       </w:pPr>
       <w:r>
-        <w:t>Background</w:t>
-      </w:r>
-    </w:p>
-    <w:p>
-      <w:r>
-        <w:t>The current e-PU10 platform charging options are limited in throughput and do not meet client demand for fast recharge cycles in mobile and semi-mobile deployments. A 400A single-Powerlock AC input charger with galvanic isolation removes earthing conflicts between the AC supply and the e-PU10 microgrid, while enabling significantly shorter recharge times. Liquid cooling is required to fit within the existing power module envelope and to keep total system heat dissipation below 7 kW (efficiency &gt; 97.5%).</w:t>
+        <w:t>Objectives</w:t>
+      </w:r>
+    </w:p>
+    <w:p>
+      <w:pPr>
+        <w:pStyle w:val="ListParagraph"/>
+      </w:pPr>
+      <w:r>
+        <w:t>•  Develop a 400A AC/DC charger with galvanic isolation, ready for series production in the e-PU10</w:t>
+      </w:r>
+    </w:p>
+    <w:p>
+      <w:pPr>
+        <w:pStyle w:val="ListParagraph"/>
+      </w:pPr>
+      <w:r>
+        <w:t>•  Liquid cooled, industrial EMC compliant (IEC 61000) design fitting the e-PU10 power module envelope</w:t>
+      </w:r>
+    </w:p>
+    <w:p>
+      <w:pPr>
+        <w:pStyle w:val="ListParagraph"/>
+      </w:pPr>
+      <w:r>
+        <w:t>•  Compliance with CE, IEC 61439, NEN 1010 and other applicable EU standards</w:t>
+      </w:r>
+    </w:p>
+    <w:p>
+      <w:pPr>
+        <w:pStyle w:val="ListParagraph"/>
+      </w:pPr>
+      <w:r>
+        <w:t>•  Continuous operation at 100% rated power under nominal conditions (25 °C)</w:t>
+      </w:r>
+    </w:p>
+    <w:p>
+      <w:pPr>
+        <w:pStyle w:val="ListParagraph"/>
+      </w:pPr>
+      <w:r>
+        <w:t>•  Material cost &lt; 20 000 € per system</w:t>
+      </w:r>
+    </w:p>
+    <w:p>
+      <w:pPr>
+        <w:pStyle w:val="ListParagraph"/>
+      </w:pPr>
+      <w:r>
+        <w:t>•  Integration with e-PU10 controls via ModbusTCP (preferred), CAN, Profinet or EtherCAT</w:t>
+      </w:r>
+    </w:p>
+    <w:p>
+      <w:pPr>
+        <w:pStyle w:val="ListParagraph"/>
+      </w:pPr>
+      <w:r>
+        <w:t>•  Release of series-ready product, documentation and sales material before November 2026</w:t>
       </w:r>
     </w:p>
     <w:p>
@@ -519,75 +511,81 @@
         <w:pStyle w:val="Heading2"/>
       </w:pPr>
       <w:r>
-        <w:t>Objectives</w:t>
-      </w:r>
-    </w:p>
-    <w:p>
-      <w:r>
-        <w:t>Main objectives are:</w:t>
-      </w:r>
-    </w:p>
-    <w:p>
-      <w:pPr>
-        <w:pStyle w:val="ListParagraph"/>
-      </w:pPr>
-      <w:r/>
-      <w:r>
-        <w:t>•  Development of a 400A AC/DC charger with galvanic isolation, suitable for series production in the e-PU10</w:t>
-      </w:r>
-    </w:p>
-    <w:p>
-      <w:pPr>
-        <w:pStyle w:val="ListParagraph"/>
-      </w:pPr>
-      <w:r/>
-      <w:r>
-        <w:t>•  Compliance with IEC 61439, NEN 1010 and all other applicable standards (EU)</w:t>
-      </w:r>
-    </w:p>
-    <w:p>
-      <w:pPr>
-        <w:pStyle w:val="ListParagraph"/>
-      </w:pPr>
-      <w:r/>
-      <w:r>
-        <w:t>•  Liquid cooled, industrial EMC compliant (IEC 61000) design that fits within the e-PU10 power module envelope</w:t>
-      </w:r>
-    </w:p>
-    <w:p>
-      <w:pPr>
-        <w:pStyle w:val="ListParagraph"/>
-      </w:pPr>
-      <w:r/>
-      <w:r>
-        <w:t>•  Continuous operation at 100% rated power under nominal conditions (25 °C)</w:t>
-      </w:r>
-    </w:p>
-    <w:p>
-      <w:pPr>
-        <w:pStyle w:val="ListParagraph"/>
-      </w:pPr>
-      <w:r/>
-      <w:r>
-        <w:t>•  Material cost below 20 000 € per system</w:t>
-      </w:r>
-    </w:p>
-    <w:p>
-      <w:pPr>
-        <w:pStyle w:val="ListParagraph"/>
-      </w:pPr>
-      <w:r/>
-      <w:r>
-        <w:t>•  Integration with e-PU10 controls via ModbusTCP (preferred), CAN, Profinet or EtherCAT</w:t>
-      </w:r>
-    </w:p>
-    <w:p>
-      <w:pPr>
-        <w:pStyle w:val="ListParagraph"/>
-      </w:pPr>
-      <w:r/>
-      <w:r>
-        <w:t>•  Release of a series-ready product including documentation and sales material before November 2026</w:t>
+        <w:t>Deliverables</w:t>
+      </w:r>
+    </w:p>
+    <w:p>
+      <w:pPr>
+        <w:pStyle w:val="ListParagraph"/>
+      </w:pPr>
+      <w:r>
+        <w:t>•  Validated 400A AC/DC charger prototype</w:t>
+      </w:r>
+    </w:p>
+    <w:p>
+      <w:pPr>
+        <w:pStyle w:val="ListParagraph"/>
+      </w:pPr>
+      <w:r>
+        <w:t>•  Mechanical and electrical detailed design package</w:t>
+      </w:r>
+    </w:p>
+    <w:p>
+      <w:pPr>
+        <w:pStyle w:val="ListParagraph"/>
+      </w:pPr>
+      <w:r>
+        <w:t>•  Build book and assembly instructions</w:t>
+      </w:r>
+    </w:p>
+    <w:p>
+      <w:pPr>
+        <w:pStyle w:val="ListParagraph"/>
+      </w:pPr>
+      <w:r>
+        <w:t>•  CE technical file (manual, design calculations, operating instructions)</w:t>
+      </w:r>
+    </w:p>
+    <w:p>
+      <w:pPr>
+        <w:pStyle w:val="ListParagraph"/>
+      </w:pPr>
+      <w:r>
+        <w:t>•  e-PU10 software integration package</w:t>
+      </w:r>
+    </w:p>
+    <w:p>
+      <w:pPr>
+        <w:pStyle w:val="ListParagraph"/>
+      </w:pPr>
+      <w:r>
+        <w:t>•  Test and validation report</w:t>
+      </w:r>
+    </w:p>
+    <w:p>
+      <w:pPr>
+        <w:pStyle w:val="ListParagraph"/>
+      </w:pPr>
+      <w:r>
+        <w:t>•  Sales one-pager and transfer to the sales matrix</w:t>
+      </w:r>
+    </w:p>
+    <w:p>
+      <w:pPr>
+        <w:pStyle w:val="Heading1"/>
+      </w:pPr>
+      <w:r>
+        <w:t>Project Scope</w:t>
+      </w:r>
+    </w:p>
+    <w:p>
+      <w:r>
+        <w:t>The project covers specification, conceptual and detailed design, prototype build, validation and series-production release of the charger as a module inside the standard e-PU10 power-module envelope. Existing mechanical, thermal and control interfaces are reused. The charger is unidirectional (AC→DC), liquid cooled, galvanically isolated, supports a DC range of at least 600–800 VDC and is controllable down to a minimum of 55 kW / 80 A.</w:t>
+      </w:r>
+    </w:p>
+    <w:p>
+      <w:r>
+        <w:t>Out of scope: changes to the e-PU10 battery/BMS or cabinet outside the charger envelope, bidirectional operation, and field installation/commissioning at customer sites.</w:t>
       </w:r>
     </w:p>
     <w:p>
@@ -595,78 +593,119 @@
         <w:pStyle w:val="Heading2"/>
       </w:pPr>
       <w:r>
-        <w:t>Deliverables</w:t>
-      </w:r>
-    </w:p>
-    <w:p>
-      <w:pPr>
-        <w:pStyle w:val="ListParagraph"/>
-      </w:pPr>
-      <w:r/>
-      <w:r>
-        <w:t>•  Validated 400A AC/DC charger prototype</w:t>
-      </w:r>
-    </w:p>
-    <w:p>
-      <w:pPr>
-        <w:pStyle w:val="ListParagraph"/>
-      </w:pPr>
-      <w:r/>
-      <w:r>
-        <w:t>•  Mechanical and electrical detailed design package</w:t>
-      </w:r>
-    </w:p>
-    <w:p>
-      <w:pPr>
-        <w:pStyle w:val="ListParagraph"/>
-      </w:pPr>
-      <w:r/>
-      <w:r>
-        <w:t>•  Build book and assembly instructions</w:t>
-      </w:r>
-    </w:p>
-    <w:p>
-      <w:pPr>
-        <w:pStyle w:val="ListParagraph"/>
-      </w:pPr>
-      <w:r/>
-      <w:r>
-        <w:t>•  CE technical file (manual, design calculations, operating instructions)</w:t>
-      </w:r>
-    </w:p>
-    <w:p>
-      <w:pPr>
-        <w:pStyle w:val="ListParagraph"/>
-      </w:pPr>
-      <w:r/>
-      <w:r>
-        <w:t>•  e-PU10 software integration package</w:t>
-      </w:r>
-    </w:p>
-    <w:p>
-      <w:pPr>
-        <w:pStyle w:val="ListParagraph"/>
-      </w:pPr>
-      <w:r/>
-      <w:r>
-        <w:t>•  Test and validation report</w:t>
-      </w:r>
-    </w:p>
-    <w:p>
-      <w:pPr>
-        <w:pStyle w:val="ListParagraph"/>
-      </w:pPr>
-      <w:r/>
-      <w:r>
-        <w:t>•  Sales one-pager and transfer to the sales matrix</w:t>
-      </w:r>
-    </w:p>
-    <w:p>
-      <w:pPr>
-        <w:pStyle w:val="Heading1"/>
-      </w:pPr>
-      <w:r>
-        <w:t>Project Scope</w:t>
+        <w:t>Mandatory (Must-Have) Criteria</w:t>
+      </w:r>
+    </w:p>
+    <w:p>
+      <w:pPr>
+        <w:pStyle w:val="ListParagraph"/>
+      </w:pPr>
+      <w:r>
+        <w:t>•  Galvanic isolation between AC and DC</w:t>
+      </w:r>
+    </w:p>
+    <w:p>
+      <w:pPr>
+        <w:pStyle w:val="ListParagraph"/>
+      </w:pPr>
+      <w:r>
+        <w:t>•  400 / 500 A Powerlock set (3P + PE) AC input</w:t>
+      </w:r>
+    </w:p>
+    <w:p>
+      <w:pPr>
+        <w:pStyle w:val="ListParagraph"/>
+      </w:pPr>
+      <w:r>
+        <w:t>•  Unidirectional AC → DC, liquid cooled</w:t>
+      </w:r>
+    </w:p>
+    <w:p>
+      <w:pPr>
+        <w:pStyle w:val="ListParagraph"/>
+      </w:pPr>
+      <w:r>
+        <w:t>•  DC voltage range ≥ 600–800 VDC (wider acceptable)</w:t>
+      </w:r>
+    </w:p>
+    <w:p>
+      <w:pPr>
+        <w:pStyle w:val="ListParagraph"/>
+      </w:pPr>
+      <w:r>
+        <w:t>•  Material cost &lt; 20 000 € per system</w:t>
+      </w:r>
+    </w:p>
+    <w:p>
+      <w:pPr>
+        <w:pStyle w:val="ListParagraph"/>
+      </w:pPr>
+      <w:r>
+        <w:t>•  Comms: ModbusTCP (preferred), CAN, Profinet or EtherCAT</w:t>
+      </w:r>
+    </w:p>
+    <w:p>
+      <w:pPr>
+        <w:pStyle w:val="ListParagraph"/>
+      </w:pPr>
+      <w:r>
+        <w:t>•  EU compliant: CE, IEC 61439, NEN 1010 and other applicable standards</w:t>
+      </w:r>
+    </w:p>
+    <w:p>
+      <w:pPr>
+        <w:pStyle w:val="ListParagraph"/>
+      </w:pPr>
+      <w:r>
+        <w:t>•  Mobile-capable, vibration resistant</w:t>
+      </w:r>
+    </w:p>
+    <w:p>
+      <w:pPr>
+        <w:pStyle w:val="ListParagraph"/>
+      </w:pPr>
+      <w:r>
+        <w:t>•  Minimum settable power ≤ 55 kW / 80 A</w:t>
+      </w:r>
+    </w:p>
+    <w:p>
+      <w:pPr>
+        <w:pStyle w:val="ListParagraph"/>
+      </w:pPr>
+      <w:r>
+        <w:t>•  Acceptable inrush with C-type breaker (C80)</w:t>
+      </w:r>
+    </w:p>
+    <w:p>
+      <w:pPr>
+        <w:pStyle w:val="ListParagraph"/>
+      </w:pPr>
+      <w:r>
+        <w:t>•  Fits e-PU10 power module envelope; system weight &lt; 500 kg</w:t>
+      </w:r>
+    </w:p>
+    <w:p>
+      <w:pPr>
+        <w:pStyle w:val="ListParagraph"/>
+      </w:pPr>
+      <w:r>
+        <w:t>•  Heat dissipation &lt; 7 kW (efficiency &gt; 97.5%)</w:t>
+      </w:r>
+    </w:p>
+    <w:p>
+      <w:pPr>
+        <w:pStyle w:val="ListParagraph"/>
+      </w:pPr>
+      <w:r>
+        <w:t>•  DC leakage current &lt; e-PU10 battery precharge capacity</w:t>
+      </w:r>
+    </w:p>
+    <w:p>
+      <w:pPr>
+        <w:pStyle w:val="ListParagraph"/>
+      </w:pPr>
+      <w:r>
+        <w:t>•  Industrial EMC (IEC 61000) or better</w:t>
       </w:r>
     </w:p>
     <w:p>
@@ -674,194 +713,21 @@
         <w:pStyle w:val="Heading2"/>
       </w:pPr>
       <w:r>
-        <w:t>General scope of supply</w:t>
-      </w:r>
-    </w:p>
-    <w:p>
-      <w:r>
-        <w:t>The project covers the specification, conceptual and detailed design, prototype build, validation and series-production release of a 400A AC/DC charger option for the e-PU10 BESS. Existing e-PU10 mechanical, thermal and control interfaces are reused; the charger module is designed to integrate within the standard power module footprint without modification of surrounding subsystems.</w:t>
-      </w:r>
-    </w:p>
-    <w:p>
-      <w:r>
-        <w:t>The system is unidirectional (AC → DC), liquid cooled, and provides galvanic isolation between AC and DC. The charger shall support a DC voltage range of at least 600 – 800 VDC and provide controllable output power down to 55 kW / 80 A as a minimum.</w:t>
-      </w:r>
-    </w:p>
-    <w:p>
-      <w:pPr>
-        <w:pStyle w:val="Heading2"/>
-      </w:pPr>
-      <w:r>
-        <w:t>Mandatory (Must-Have) Criteria</w:t>
-      </w:r>
-    </w:p>
-    <w:p>
-      <w:r>
-        <w:t>The following requirements are mandatory and must be satisfied for the project to be considered successful:</w:t>
-      </w:r>
-    </w:p>
-    <w:p>
-      <w:pPr>
-        <w:pStyle w:val="ListParagraph"/>
-      </w:pPr>
-      <w:r/>
-      <w:r>
-        <w:t>•  Galvanic isolation between AC and DC sides</w:t>
-      </w:r>
-    </w:p>
-    <w:p>
-      <w:pPr>
-        <w:pStyle w:val="ListParagraph"/>
-      </w:pPr>
-      <w:r/>
-      <w:r>
-        <w:t>•  400 / 500 A Powerlock set (3P + PE) AC input</w:t>
-      </w:r>
-    </w:p>
-    <w:p>
-      <w:pPr>
-        <w:pStyle w:val="ListParagraph"/>
-      </w:pPr>
-      <w:r/>
-      <w:r>
-        <w:t>•  Unidirectional AC → DC operation</w:t>
-      </w:r>
-    </w:p>
-    <w:p>
-      <w:pPr>
-        <w:pStyle w:val="ListParagraph"/>
-      </w:pPr>
-      <w:r/>
-      <w:r>
-        <w:t>•  Liquid cooled</w:t>
-      </w:r>
-    </w:p>
-    <w:p>
-      <w:pPr>
-        <w:pStyle w:val="ListParagraph"/>
-      </w:pPr>
-      <w:r/>
-      <w:r>
-        <w:t>•  DC voltage range of at least 600 – 800 VDC (wider acceptable)</w:t>
-      </w:r>
-    </w:p>
-    <w:p>
-      <w:pPr>
-        <w:pStyle w:val="ListParagraph"/>
-      </w:pPr>
-      <w:r/>
-      <w:r>
-        <w:t>•  Material cost below 20 000 € per system</w:t>
-      </w:r>
-    </w:p>
-    <w:p>
-      <w:pPr>
-        <w:pStyle w:val="ListParagraph"/>
-      </w:pPr>
-      <w:r/>
-      <w:r>
-        <w:t>•  Industrial control / monitoring protocol: ModbusTCP (preferred), CAN, Profinet or EtherCAT</w:t>
-      </w:r>
-    </w:p>
-    <w:p>
-      <w:pPr>
-        <w:pStyle w:val="ListParagraph"/>
-      </w:pPr>
-      <w:r/>
-      <w:r>
-        <w:t>•  EU compliant (CE, IEC 61439, NEN 1010 and all other applicable standards)</w:t>
-      </w:r>
-    </w:p>
-    <w:p>
-      <w:pPr>
-        <w:pStyle w:val="ListParagraph"/>
-      </w:pPr>
-      <w:r/>
-      <w:r>
-        <w:t>•  Suitable for mobile applications, vibration resistant</w:t>
-      </w:r>
-    </w:p>
-    <w:p>
-      <w:pPr>
-        <w:pStyle w:val="ListParagraph"/>
-      </w:pPr>
-      <w:r/>
-      <w:r>
-        <w:t>•  Minimum settable power at least 55 kW / 80 A</w:t>
-      </w:r>
-    </w:p>
-    <w:p>
-      <w:pPr>
-        <w:pStyle w:val="ListParagraph"/>
-      </w:pPr>
-      <w:r/>
-      <w:r>
-        <w:t>•  Acceptable inrush behaviour with C-type circuit breaker (C80) on AC source</w:t>
-      </w:r>
-    </w:p>
-    <w:p>
-      <w:pPr>
-        <w:pStyle w:val="ListParagraph"/>
-      </w:pPr>
-      <w:r/>
-      <w:r>
-        <w:t>•  Compatible with the e-PU10 power module envelope and weight budget (&lt; 500 kg system weight)</w:t>
-      </w:r>
-    </w:p>
-    <w:p>
-      <w:pPr>
-        <w:pStyle w:val="ListParagraph"/>
-      </w:pPr>
-      <w:r/>
-      <w:r>
-        <w:t>•  Total system heat production &lt; 7 kW (efficiency &gt; 97.5%)</w:t>
-      </w:r>
-    </w:p>
-    <w:p>
-      <w:pPr>
-        <w:pStyle w:val="ListParagraph"/>
-      </w:pPr>
-      <w:r/>
-      <w:r>
-        <w:t>•  DC leakage current below e-PU10 battery precharge power capacity</w:t>
-      </w:r>
-    </w:p>
-    <w:p>
-      <w:pPr>
-        <w:pStyle w:val="ListParagraph"/>
-      </w:pPr>
-      <w:r/>
-      <w:r>
-        <w:t>•  Industrial EMC (IEC 61000) or better</w:t>
-      </w:r>
-    </w:p>
-    <w:p>
-      <w:pPr>
-        <w:pStyle w:val="Heading2"/>
-      </w:pPr>
-      <w:r>
         <w:t>Recommended (Nice-to-Have) Criteria</w:t>
       </w:r>
     </w:p>
     <w:p>
-      <w:r>
-        <w:t>The following requirements are not mandatory, but shall be pursued where technically and commercially feasible without compromising the must-have criteria:</w:t>
-      </w:r>
-    </w:p>
-    <w:p>
-      <w:pPr>
-        <w:pStyle w:val="ListParagraph"/>
-      </w:pPr>
-      <w:r/>
-      <w:r>
-        <w:t>•  Modular setup in power steps of minimum 30 kW and maximum 100 kW</w:t>
-      </w:r>
-    </w:p>
-    <w:p>
-      <w:pPr>
-        <w:pStyle w:val="ListParagraph"/>
-      </w:pPr>
-      <w:r/>
+      <w:pPr>
+        <w:pStyle w:val="ListParagraph"/>
+      </w:pPr>
+      <w:r>
+        <w:t>•  Modular setup in steps of 30–100 kW</w:t>
+      </w:r>
+    </w:p>
+    <w:p>
+      <w:pPr>
+        <w:pStyle w:val="ListParagraph"/>
+      </w:pPr>
       <w:r>
         <w:t>•  Hot-swappable / serviceable without interrupting the BESS microgrid</w:t>
       </w:r>
@@ -870,16 +736,14 @@
       <w:pPr>
         <w:pStyle w:val="ListParagraph"/>
       </w:pPr>
-      <w:r/>
-      <w:r>
-        <w:t>•  High intrinsic reliability (&gt; 98% uptime per system) through redundancy</w:t>
-      </w:r>
-    </w:p>
-    <w:p>
-      <w:pPr>
-        <w:pStyle w:val="ListParagraph"/>
-      </w:pPr>
-      <w:r/>
+      <w:r>
+        <w:t>•  High intrinsic reliability (&gt; 98% uptime) through redundancy</w:t>
+      </w:r>
+    </w:p>
+    <w:p>
+      <w:pPr>
+        <w:pStyle w:val="ListParagraph"/>
+      </w:pPr>
       <w:r>
         <w:t>•  Active PFC power supply</w:t>
       </w:r>
@@ -888,18 +752,16 @@
       <w:pPr>
         <w:pStyle w:val="ListParagraph"/>
       </w:pPr>
-      <w:r/>
-      <w:r>
-        <w:t>•  Lower minimum settable power: at least 20 kW / 32 A</w:t>
-      </w:r>
-    </w:p>
-    <w:p>
-      <w:pPr>
-        <w:pStyle w:val="ListParagraph"/>
-      </w:pPr>
-      <w:r/>
-      <w:r>
-        <w:t>•  Acceptable inrush behaviour with B-type circuit breaker (B32) on AC source</w:t>
+      <w:r>
+        <w:t>•  Lower minimum settable power: ≤ 20 kW / 32 A</w:t>
+      </w:r>
+    </w:p>
+    <w:p>
+      <w:pPr>
+        <w:pStyle w:val="ListParagraph"/>
+      </w:pPr>
+      <w:r>
+        <w:t>•  Acceptable inrush with B-type breaker (B32)</w:t>
       </w:r>
     </w:p>
     <w:p>
@@ -958,7 +820,7 @@
           <w:p>
             <w:r/>
             <w:r>
-              <w:t>AC input rating</w:t>
+              <w:t>AC input</w:t>
             </w:r>
           </w:p>
         </w:tc>
@@ -982,7 +844,7 @@
           <w:p>
             <w:r/>
             <w:r>
-              <w:t>DC output voltage range</w:t>
+              <w:t>DC output range</w:t>
             </w:r>
           </w:p>
         </w:tc>
@@ -993,7 +855,7 @@
           <w:p>
             <w:r/>
             <w:r>
-              <w:t>600 – 800 VDC (wider acceptable)</w:t>
+              <w:t>600–800 VDC (wider acceptable)</w:t>
             </w:r>
           </w:p>
         </w:tc>
@@ -1017,7 +879,7 @@
           <w:p>
             <w:r/>
             <w:r>
-              <w:t>Unidirectional AC → DC, galvanically isolated</w:t>
+              <w:t>Unidirectional AC→DC, galvanically isolated</w:t>
             </w:r>
           </w:p>
         </w:tc>
@@ -1030,7 +892,7 @@
           <w:p>
             <w:r/>
             <w:r>
-              <w:t>Minimum settable power</w:t>
+              <w:t>Min. settable power</w:t>
             </w:r>
           </w:p>
         </w:tc>
@@ -1054,7 +916,7 @@
           <w:p>
             <w:r/>
             <w:r>
-              <w:t>Efficiency</w:t>
+              <w:t>Efficiency / heat</w:t>
             </w:r>
           </w:p>
         </w:tc>
@@ -1065,7 +927,7 @@
           <w:p>
             <w:r/>
             <w:r>
-              <w:t>&gt; 97.5%</w:t>
+              <w:t>&gt; 97.5% / &lt; 7 kW</w:t>
             </w:r>
           </w:p>
         </w:tc>
@@ -1078,7 +940,7 @@
           <w:p>
             <w:r/>
             <w:r>
-              <w:t>Total system heat dissipation</w:t>
+              <w:t>Cooling</w:t>
             </w:r>
           </w:p>
         </w:tc>
@@ -1089,7 +951,7 @@
           <w:p>
             <w:r/>
             <w:r>
-              <w:t>&lt; 7 kW</w:t>
+              <w:t>Liquid cooled</w:t>
             </w:r>
           </w:p>
         </w:tc>
@@ -1102,7 +964,7 @@
           <w:p>
             <w:r/>
             <w:r>
-              <w:t>Cooling</w:t>
+              <w:t>Communication</w:t>
             </w:r>
           </w:p>
         </w:tc>
@@ -1113,7 +975,7 @@
           <w:p>
             <w:r/>
             <w:r>
-              <w:t>Liquid cooled</w:t>
+              <w:t>ModbusTCP (pref.), CAN, Profinet, EtherCAT</w:t>
             </w:r>
           </w:p>
         </w:tc>
@@ -1126,7 +988,7 @@
           <w:p>
             <w:r/>
             <w:r>
-              <w:t>Communication</w:t>
+              <w:t>EMC</w:t>
             </w:r>
           </w:p>
         </w:tc>
@@ -1137,7 +999,7 @@
           <w:p>
             <w:r/>
             <w:r>
-              <w:t>ModbusTCP (preferred), CAN, Profinet, EtherCAT</w:t>
+              <w:t>IEC 61000 industrial or better</w:t>
             </w:r>
           </w:p>
         </w:tc>
@@ -1150,7 +1012,7 @@
           <w:p>
             <w:r/>
             <w:r>
-              <w:t>EMC</w:t>
+              <w:t>Envelope / weight</w:t>
             </w:r>
           </w:p>
         </w:tc>
@@ -1161,7 +1023,7 @@
           <w:p>
             <w:r/>
             <w:r>
-              <w:t>IEC 61000 industrial or better</w:t>
+              <w:t>≤ e-PU10 power module / &lt; 500 kg</w:t>
             </w:r>
           </w:p>
         </w:tc>
@@ -1174,55 +1036,7 @@
           <w:p>
             <w:r/>
             <w:r>
-              <w:t>Mechanical envelope</w:t>
-            </w:r>
-          </w:p>
-        </w:tc>
-        <w:tc>
-          <w:tcPr>
-            <w:tcW w:type="dxa" w:w="4513"/>
-          </w:tcPr>
-          <w:p>
-            <w:r/>
-            <w:r>
-              <w:t>≤ e-PU10 power module size</w:t>
-            </w:r>
-          </w:p>
-        </w:tc>
-      </w:tr>
-      <w:tr>
-        <w:tc>
-          <w:tcPr>
-            <w:tcW w:type="dxa" w:w="4513"/>
-          </w:tcPr>
-          <w:p>
-            <w:r/>
-            <w:r>
-              <w:t>System weight</w:t>
-            </w:r>
-          </w:p>
-        </w:tc>
-        <w:tc>
-          <w:tcPr>
-            <w:tcW w:type="dxa" w:w="4513"/>
-          </w:tcPr>
-          <w:p>
-            <w:r/>
-            <w:r>
-              <w:t>&lt; 500 kg</w:t>
-            </w:r>
-          </w:p>
-        </w:tc>
-      </w:tr>
-      <w:tr>
-        <w:tc>
-          <w:tcPr>
-            <w:tcW w:type="dxa" w:w="4513"/>
-          </w:tcPr>
-          <w:p>
-            <w:r/>
-            <w:r>
-              <w:t>Material cost target</w:t>
+              <w:t>Material cost</w:t>
             </w:r>
           </w:p>
         </w:tc>
@@ -1290,46 +1104,116 @@
     <w:p/>
     <w:p>
       <w:pPr>
+        <w:pStyle w:val="Heading1"/>
+      </w:pPr>
+      <w:r>
+        <w:t>Activities</w:t>
+      </w:r>
+    </w:p>
+    <w:p>
+      <w:r>
+        <w:t>Execution follows the VDL TRL model, with early phases merged given the compact scope. Each TRL phase ends with a formal tollgate review.</w:t>
+      </w:r>
+    </w:p>
+    <w:p>
+      <w:pPr>
+        <w:pStyle w:val="ListParagraph"/>
+      </w:pPr>
+      <w:r>
+        <w:t>•  TRL 2 – Scope &amp; market research: scope, key results, technical spec, risk and scope-change analysis; supplier/component research (price, quality, documentation)</w:t>
+      </w:r>
+    </w:p>
+    <w:p>
+      <w:pPr>
+        <w:pStyle w:val="ListParagraph"/>
+      </w:pPr>
+      <w:r>
+        <w:t>•  TRL 3 – Conceptual design: component selection, single-line and mechanical concept, cost and engineering-impact estimate, material price estimation</w:t>
+      </w:r>
+    </w:p>
+    <w:p>
+      <w:pPr>
+        <w:pStyle w:val="ListParagraph"/>
+      </w:pPr>
+      <w:r>
+        <w:t>•  TRL 4/5 – Detailed design: mechanical, electrical, e-PU10 software integration, CE documentation, build book</w:t>
+      </w:r>
+    </w:p>
+    <w:p>
+      <w:pPr>
+        <w:pStyle w:val="ListParagraph"/>
+      </w:pPr>
+      <w:r>
+        <w:t>•  TRL 6 – Prototype build &amp; test: assembly, functional and performance validation against must-have criteria</w:t>
+      </w:r>
+    </w:p>
+    <w:p>
+      <w:pPr>
+        <w:pStyle w:val="ListParagraph"/>
+      </w:pPr>
+      <w:r>
+        <w:t>•  TRL 8 – Sales readiness: one-pager and technical datasheet</w:t>
+      </w:r>
+    </w:p>
+    <w:p>
+      <w:pPr>
+        <w:pStyle w:val="ListParagraph"/>
+      </w:pPr>
+      <w:r>
+        <w:t>•  TRL 9 – Product release: finalize documentation, transfer to sales matrix</w:t>
+      </w:r>
+    </w:p>
+    <w:p>
+      <w:pPr>
         <w:pStyle w:val="Heading2"/>
       </w:pPr>
       <w:r>
-        <w:t>Out of scope</w:t>
-      </w:r>
-    </w:p>
-    <w:p>
-      <w:pPr>
-        <w:pStyle w:val="ListParagraph"/>
-      </w:pPr>
-      <w:r/>
-      <w:r>
-        <w:t>•  Modifications to the e-PU10 main battery or BMS</w:t>
-      </w:r>
-    </w:p>
-    <w:p>
-      <w:pPr>
-        <w:pStyle w:val="ListParagraph"/>
-      </w:pPr>
-      <w:r/>
-      <w:r>
-        <w:t>•  Changes to the e-PU10 mechanical cabinet outside the charger module envelope</w:t>
-      </w:r>
-    </w:p>
-    <w:p>
-      <w:pPr>
-        <w:pStyle w:val="ListParagraph"/>
-      </w:pPr>
-      <w:r/>
-      <w:r>
-        <w:t>•  Bidirectional (DC → AC) operation</w:t>
-      </w:r>
-    </w:p>
-    <w:p>
-      <w:pPr>
-        <w:pStyle w:val="ListParagraph"/>
-      </w:pPr>
-      <w:r/>
-      <w:r>
-        <w:t>•  Field installation and commissioning at customer sites</w:t>
+        <w:t>Progress review</w:t>
+      </w:r>
+    </w:p>
+    <w:p>
+      <w:pPr>
+        <w:pStyle w:val="ListParagraph"/>
+      </w:pPr>
+      <w:r>
+        <w:t>•  Weekly project update meeting (technical alignment, planning, actions)</w:t>
+      </w:r>
+    </w:p>
+    <w:p>
+      <w:pPr>
+        <w:pStyle w:val="ListParagraph"/>
+      </w:pPr>
+      <w:r>
+        <w:t>•  Bi-weekly engineering management progress review</w:t>
+      </w:r>
+    </w:p>
+    <w:p>
+      <w:pPr>
+        <w:pStyle w:val="ListParagraph"/>
+      </w:pPr>
+      <w:r>
+        <w:t>•  Formal TRL tollgate review per phase, using the standard tollgate template</w:t>
+      </w:r>
+    </w:p>
+    <w:p>
+      <w:pPr>
+        <w:pStyle w:val="ListParagraph"/>
+      </w:pPr>
+      <w:r>
+        <w:t>•  Continuous task and planning tracking in GitHub</w:t>
+      </w:r>
+    </w:p>
+    <w:p>
+      <w:pPr>
+        <w:pStyle w:val="ListParagraph"/>
+      </w:pPr>
+      <w:r>
+        <w:t>•  Standard reporting: technical progress, open actions/risks, budget and hours, roadblocks</w:t>
+      </w:r>
+    </w:p>
+    <w:p>
+      <w:r>
+        <w:t>Project information is stored in VDL OneDrive during execution; controlled documents (design files, 3D models, CE file) migrate to PDM / G drive on release.</w:t>
       </w:r>
     </w:p>
     <w:p>
@@ -1337,143 +1221,12 @@
         <w:pStyle w:val="Heading1"/>
       </w:pPr>
       <w:r>
-        <w:t>Activities</w:t>
-      </w:r>
-    </w:p>
-    <w:p>
-      <w:r>
-        <w:t>Project execution follows the VDL TRL-based model. Given the limited duration and well-defined scope, the early TRL phases are merged and the field/pilot phase (TRL 7) is covered by integration testing on an existing e-PU10. Each TRL phase ends with a formal tollgate review.</w:t>
-      </w:r>
-    </w:p>
-    <w:p>
-      <w:pPr>
-        <w:pStyle w:val="ListParagraph"/>
-      </w:pPr>
-      <w:r/>
-      <w:r>
-        <w:t>•  TRL 2 – Scope &amp; Market research: project scope, key results, technical specification, scope-change and risk analysis; component market research (suppliers, devices, pricing, documentation quality)</w:t>
-      </w:r>
-    </w:p>
-    <w:p>
-      <w:pPr>
-        <w:pStyle w:val="ListParagraph"/>
-      </w:pPr>
-      <w:r/>
-      <w:r>
-        <w:t>•  TRL 3 – Conceptual design: component selection, single-line diagram, mechanical concept, cost-price and engineering impact estimate, material price estimation</w:t>
-      </w:r>
-    </w:p>
-    <w:p>
-      <w:pPr>
-        <w:pStyle w:val="ListParagraph"/>
-      </w:pPr>
-      <w:r/>
-      <w:r>
-        <w:t>•  TRL 4/5 – Detailed design: mechanical and electrical detailed design, e-PU10 software integration, CE documentation drafting, build-book preparation</w:t>
-      </w:r>
-    </w:p>
-    <w:p>
-      <w:pPr>
-        <w:pStyle w:val="ListParagraph"/>
-      </w:pPr>
-      <w:r/>
-      <w:r>
-        <w:t>•  TRL 6 – Prototype build &amp; test: prototype assembly, functional testing, performance validation against must-have criteria</w:t>
-      </w:r>
-    </w:p>
-    <w:p>
-      <w:pPr>
-        <w:pStyle w:val="ListParagraph"/>
-      </w:pPr>
-      <w:r/>
-      <w:r>
-        <w:t>•  TRL 8 – Sales readiness: sales one-pager, technical data sheet</w:t>
-      </w:r>
-    </w:p>
-    <w:p>
-      <w:pPr>
-        <w:pStyle w:val="ListParagraph"/>
-      </w:pPr>
-      <w:r/>
-      <w:r>
-        <w:t>•  TRL 9 – Product release: finalize documentation, transfer product to sales matrix</w:t>
-      </w:r>
-    </w:p>
-    <w:p>
-      <w:r>
-        <w:t>Each TRL phase ends with a technical review and formal approval gate before continuation.</w:t>
-      </w:r>
-    </w:p>
-    <w:p>
-      <w:pPr>
-        <w:pStyle w:val="Heading2"/>
-      </w:pPr>
-      <w:r>
-        <w:t>Progress review</w:t>
-      </w:r>
-    </w:p>
-    <w:p>
-      <w:r>
-        <w:t>Project progress is monitored through:</w:t>
-      </w:r>
-    </w:p>
-    <w:p>
-      <w:pPr>
-        <w:pStyle w:val="ListParagraph"/>
-      </w:pPr>
-      <w:r/>
-      <w:r>
-        <w:t>•  Weekly project update meetings for technical alignment, planning and action tracking</w:t>
-      </w:r>
-    </w:p>
-    <w:p>
-      <w:pPr>
-        <w:pStyle w:val="ListParagraph"/>
-      </w:pPr>
-      <w:r/>
-      <w:r>
-        <w:t>•  Bi-weekly engineering management progress review</w:t>
-      </w:r>
-    </w:p>
-    <w:p>
-      <w:pPr>
-        <w:pStyle w:val="ListParagraph"/>
-      </w:pPr>
-      <w:r/>
-      <w:r>
-        <w:t>•  Formal TRL tollgate review at the end of each phase, documented using the standard TRL tollgate template</w:t>
-      </w:r>
-    </w:p>
-    <w:p>
-      <w:pPr>
-        <w:pStyle w:val="ListParagraph"/>
-      </w:pPr>
-      <w:r/>
-      <w:r>
-        <w:t>•  Continuous updating of the planning and task tracking in GitHub</w:t>
-      </w:r>
-    </w:p>
-    <w:p>
-      <w:r>
-        <w:t>Standard progress reporting includes technical progress, open actions and risks, budget and hours usage, and identification of roadblocks.</w:t>
-      </w:r>
-    </w:p>
-    <w:p>
-      <w:r>
-        <w:t>All project information is stored in the VDL OneDrive during execution. Controlled documents (design files, 3D models, CE documentation) are migrated to PDM / G drive on release.</w:t>
-      </w:r>
-    </w:p>
-    <w:p>
-      <w:pPr>
-        <w:pStyle w:val="Heading1"/>
-      </w:pPr>
-      <w:r>
-        <w:t>Project Planning and Milestones</w:t>
-      </w:r>
-    </w:p>
-    <w:p>
-      <w:r>
-        <w:t>The plan reflects a compact development effort of approximately 320 hours total (260 net engineering hours) executed across a small multi-disciplinary team. The milestone overview below aligns the TRL tollgates with the kickoff and target end date.</w:t>
+        <w:t>Planning and Milestones</w:t>
+      </w:r>
+    </w:p>
+    <w:p>
+      <w:r>
+        <w:t>Total effort ≈ 320 h gross / 260 h net across a small multi-disciplinary team.</w:t>
       </w:r>
     </w:p>
     <w:tbl>
@@ -1513,7 +1266,7 @@
               <w:rPr>
                 <w:b/>
               </w:rPr>
-              <w:t>TRL gate</w:t>
+              <w:t>TRL</w:t>
             </w:r>
           </w:p>
         </w:tc>
@@ -1527,7 +1280,7 @@
               <w:rPr>
                 <w:b/>
               </w:rPr>
-              <w:t>Target date</w:t>
+              <w:t>Target</w:t>
             </w:r>
           </w:p>
         </w:tc>
@@ -1875,37 +1628,34 @@
         <w:pStyle w:val="Heading1"/>
       </w:pPr>
       <w:r>
-        <w:t>Project assessment and risk management</w:t>
-      </w:r>
-    </w:p>
-    <w:p>
-      <w:r>
-        <w:t>Key technical and project risks include:</w:t>
-      </w:r>
-    </w:p>
-    <w:p>
-      <w:pPr>
-        <w:pStyle w:val="ListParagraph"/>
-      </w:pPr>
-      <w:r/>
-      <w:r>
-        <w:t>•  Availability of suitable COTS 400A isolated AC/DC modules within the material cost target</w:t>
-      </w:r>
-    </w:p>
-    <w:p>
-      <w:pPr>
-        <w:pStyle w:val="ListParagraph"/>
-      </w:pPr>
-      <w:r/>
-      <w:r>
-        <w:t>•  Thermal performance of the liquid-cooled design within the e-PU10 envelope (&lt; 7 kW heat, &gt; 97.5% efficiency)</w:t>
-      </w:r>
-    </w:p>
-    <w:p>
-      <w:pPr>
-        <w:pStyle w:val="ListParagraph"/>
-      </w:pPr>
-      <w:r/>
+        <w:t>Risk Management</w:t>
+      </w:r>
+    </w:p>
+    <w:p>
+      <w:r>
+        <w:t>Key risks:</w:t>
+      </w:r>
+    </w:p>
+    <w:p>
+      <w:pPr>
+        <w:pStyle w:val="ListParagraph"/>
+      </w:pPr>
+      <w:r>
+        <w:t>•  Availability of suitable COTS 400A isolated AC/DC modules within the cost target</w:t>
+      </w:r>
+    </w:p>
+    <w:p>
+      <w:pPr>
+        <w:pStyle w:val="ListParagraph"/>
+      </w:pPr>
+      <w:r>
+        <w:t>•  Thermal performance within the e-PU10 envelope (&lt; 7 kW, &gt; 97.5% efficiency)</w:t>
+      </w:r>
+    </w:p>
+    <w:p>
+      <w:pPr>
+        <w:pStyle w:val="ListParagraph"/>
+      </w:pPr>
       <w:r>
         <w:t>•  EMC compliance under industrial conditions (IEC 61000)</w:t>
       </w:r>
@@ -1914,16 +1664,14 @@
       <w:pPr>
         <w:pStyle w:val="ListParagraph"/>
       </w:pPr>
-      <w:r/>
-      <w:r>
-        <w:t>•  Inrush behaviour compatibility with C-type (and ideally B-type) circuit breakers</w:t>
-      </w:r>
-    </w:p>
-    <w:p>
-      <w:pPr>
-        <w:pStyle w:val="ListParagraph"/>
-      </w:pPr>
-      <w:r/>
+      <w:r>
+        <w:t>•  Inrush compatibility with C-type (and ideally B-type) breakers</w:t>
+      </w:r>
+    </w:p>
+    <w:p>
+      <w:pPr>
+        <w:pStyle w:val="ListParagraph"/>
+      </w:pPr>
       <w:r>
         <w:t>•  Integration and communication reliability with the e-PU10 controls</w:t>
       </w:r>
@@ -1932,7 +1680,6 @@
       <w:pPr>
         <w:pStyle w:val="ListParagraph"/>
       </w:pPr>
-      <w:r/>
       <w:r>
         <w:t>•  Dependency on the e-PU10V2 development timeline</w:t>
       </w:r>
@@ -1941,7 +1688,6 @@
       <w:pPr>
         <w:pStyle w:val="ListParagraph"/>
       </w:pPr>
-      <w:r/>
       <w:r>
         <w:t>•  Supplier lead times for power electronics and Powerlock connectors</w:t>
       </w:r>
@@ -1950,59 +1696,13 @@
       <w:pPr>
         <w:pStyle w:val="ListParagraph"/>
       </w:pPr>
-      <w:r/>
       <w:r>
         <w:t>•  CE / IEC 61439 / NEN 1010 documentation completeness</w:t>
       </w:r>
     </w:p>
     <w:p>
       <w:r>
-        <w:t>Risk mitigation is achieved through:</w:t>
-      </w:r>
-    </w:p>
-    <w:p>
-      <w:pPr>
-        <w:pStyle w:val="ListParagraph"/>
-      </w:pPr>
-      <w:r/>
-      <w:r>
-        <w:t>•  Early supplier engagement and market research during TRL 2</w:t>
-      </w:r>
-    </w:p>
-    <w:p>
-      <w:pPr>
-        <w:pStyle w:val="ListParagraph"/>
-      </w:pPr>
-      <w:r/>
-      <w:r>
-        <w:t>•  Conservative thermal and EMC margins in the conceptual design</w:t>
-      </w:r>
-    </w:p>
-    <w:p>
-      <w:pPr>
-        <w:pStyle w:val="ListParagraph"/>
-      </w:pPr>
-      <w:r/>
-      <w:r>
-        <w:t>•  Incremental TRL-based validation with formal tollgates</w:t>
-      </w:r>
-    </w:p>
-    <w:p>
-      <w:pPr>
-        <w:pStyle w:val="ListParagraph"/>
-      </w:pPr>
-      <w:r/>
-      <w:r>
-        <w:t>•  Continuous alignment with the e-PU10V2 development team</w:t>
-      </w:r>
-    </w:p>
-    <w:p>
-      <w:pPr>
-        <w:pStyle w:val="ListParagraph"/>
-      </w:pPr>
-      <w:r/>
-      <w:r>
-        <w:t>•  Progressive compliance verification during detailed design</w:t>
+        <w:t>Mitigation: early supplier engagement in TRL 2; conservative thermal/EMC margins in concept; incremental TRL validation with formal tollgates; continuous alignment with the e-PU10V2 team; progressive compliance verification during detailed design.</w:t>
       </w:r>
     </w:p>
     <w:p>
@@ -2010,155 +1710,33 @@
         <w:pStyle w:val="Heading1"/>
       </w:pPr>
       <w:r>
-        <w:t>Cost, Budgets &amp; Engineering team</w:t>
-      </w:r>
-    </w:p>
-    <w:p>
-      <w:r>
-        <w:t>Project cost is driven by engineering hours, prototype hardware and validation effort. Material cost per series unit is a hard constraint:</w:t>
-      </w:r>
-    </w:p>
-    <w:p>
-      <w:pPr>
-        <w:pStyle w:val="ListParagraph"/>
-      </w:pPr>
-      <w:r/>
-      <w:r>
-        <w:t>•  Material cost per system &lt; 20 000 €</w:t>
-      </w:r>
-    </w:p>
-    <w:p>
-      <w:pPr>
-        <w:pStyle w:val="ListParagraph"/>
-      </w:pPr>
-      <w:r/>
-      <w:r>
-        <w:t>•  Total engineering effort: 260 net / 320 gross hours</w:t>
-      </w:r>
-    </w:p>
-    <w:p>
-      <w:pPr>
-        <w:pStyle w:val="Heading2"/>
-      </w:pPr>
-      <w:r>
-        <w:t>Engineering Team</w:t>
-      </w:r>
-    </w:p>
-    <w:p>
-      <w:r>
-        <w:t>Required disciplines:</w:t>
-      </w:r>
-    </w:p>
-    <w:p>
-      <w:pPr>
-        <w:pStyle w:val="ListParagraph"/>
-      </w:pPr>
-      <w:r/>
-      <w:r>
-        <w:t>•  Project Lead (Lennard)</w:t>
-      </w:r>
-    </w:p>
-    <w:p>
-      <w:pPr>
-        <w:pStyle w:val="ListParagraph"/>
-      </w:pPr>
-      <w:r/>
-      <w:r>
-        <w:t>•  Electrical engineer (power electronics)</w:t>
-      </w:r>
-    </w:p>
-    <w:p>
-      <w:pPr>
-        <w:pStyle w:val="ListParagraph"/>
-      </w:pPr>
-      <w:r/>
-      <w:r>
-        <w:t>•  Mechanical engineer (cooling and integration)</w:t>
-      </w:r>
-    </w:p>
-    <w:p>
-      <w:pPr>
-        <w:pStyle w:val="ListParagraph"/>
-      </w:pPr>
-      <w:r/>
-      <w:r>
-        <w:t>•  Software engineer (e-PU10 integration)</w:t>
-      </w:r>
-    </w:p>
-    <w:p>
-      <w:pPr>
-        <w:pStyle w:val="ListParagraph"/>
-      </w:pPr>
-      <w:r/>
-      <w:r>
-        <w:t>•  Safety / compliance engineer (CE, IEC 61439, NEN 1010)</w:t>
-      </w:r>
-    </w:p>
-    <w:p>
-      <w:pPr>
-        <w:pStyle w:val="ListParagraph"/>
-      </w:pPr>
-      <w:r/>
-      <w:r>
-        <w:t>•  Test and validation engineer</w:t>
-      </w:r>
-    </w:p>
-    <w:p>
-      <w:pPr>
-        <w:pStyle w:val="Heading2"/>
-      </w:pPr>
-      <w:r>
-        <w:t>Requirements / Prerequisites</w:t>
-      </w:r>
-    </w:p>
-    <w:p>
-      <w:r>
-        <w:t>Before execution the following prerequisites must be in place:</w:t>
-      </w:r>
-    </w:p>
-    <w:p>
-      <w:pPr>
-        <w:pStyle w:val="ListParagraph"/>
-      </w:pPr>
-      <w:r/>
-      <w:r>
-        <w:t>•  Approved project number and budget allocation</w:t>
-      </w:r>
-    </w:p>
-    <w:p>
-      <w:pPr>
-        <w:pStyle w:val="ListParagraph"/>
-      </w:pPr>
-      <w:r/>
-      <w:r>
-        <w:t>•  Availability of an e-PU10 (V1 or V2) test platform for integration</w:t>
-      </w:r>
-    </w:p>
-    <w:p>
-      <w:pPr>
-        <w:pStyle w:val="ListParagraph"/>
-      </w:pPr>
-      <w:r/>
-      <w:r>
-        <w:t>•  Established GitHub project and planning</w:t>
-      </w:r>
-    </w:p>
-    <w:p>
-      <w:pPr>
-        <w:pStyle w:val="ListParagraph"/>
-      </w:pPr>
-      <w:r/>
-      <w:r>
-        <w:t>•  Defined PLM and document control structure</w:t>
-      </w:r>
-    </w:p>
-    <w:p>
-      <w:pPr>
-        <w:pStyle w:val="ListParagraph"/>
-      </w:pPr>
-      <w:r/>
-      <w:r>
-        <w:t>•  Assigned engineering team and role allocation</w:t>
+        <w:t>Cost, Budget and Team</w:t>
+      </w:r>
+    </w:p>
+    <w:p>
+      <w:pPr>
+        <w:pStyle w:val="ListParagraph"/>
+      </w:pPr>
+      <w:r>
+        <w:t>•  Material cost target: &lt; 20 000 € per system</w:t>
+      </w:r>
+    </w:p>
+    <w:p>
+      <w:pPr>
+        <w:pStyle w:val="ListParagraph"/>
+      </w:pPr>
+      <w:r>
+        <w:t>•  Engineering effort: 260 net / 320 gross hours</w:t>
+      </w:r>
+    </w:p>
+    <w:p>
+      <w:r>
+        <w:t>Required disciplines: Project Lead (Lennard), Electrical (power electronics), Mechanical (cooling/integration), Software (e-PU10 integration), Safety/Compliance (CE, IEC 61439, NEN 1010), Test &amp; Validation.</w:t>
+      </w:r>
+    </w:p>
+    <w:p>
+      <w:r>
+        <w:t>Prerequisites: approved project number and budget; e-PU10 (V1 or V2) test platform available; GitHub project and planning established; PLM/document control structure defined; engineering team and roles assigned.</w:t>
       </w:r>
     </w:p>
     <w:p>
@@ -2166,212 +1744,36 @@
         <w:pStyle w:val="Heading1"/>
       </w:pPr>
       <w:r>
-        <w:t>Scope of work company departments and communication</w:t>
-      </w:r>
-    </w:p>
-    <w:p>
-      <w:pPr>
-        <w:pStyle w:val="Heading2"/>
-      </w:pPr>
-      <w:r>
-        <w:t>Scope of engineering</w:t>
-      </w:r>
-    </w:p>
-    <w:p>
-      <w:r>
-        <w:t>Responsible for system design, integration, testing and technical documentation:</w:t>
-      </w:r>
-    </w:p>
-    <w:p>
-      <w:pPr>
-        <w:pStyle w:val="ListParagraph"/>
-      </w:pPr>
-      <w:r/>
-      <w:r>
-        <w:t>•  Electrical and mechanical design of the charger module</w:t>
-      </w:r>
-    </w:p>
-    <w:p>
-      <w:pPr>
-        <w:pStyle w:val="ListParagraph"/>
-      </w:pPr>
-      <w:r/>
-      <w:r>
-        <w:t>•  e-PU10 software integration and communication</w:t>
-      </w:r>
-    </w:p>
-    <w:p>
-      <w:pPr>
-        <w:pStyle w:val="ListParagraph"/>
-      </w:pPr>
-      <w:r/>
-      <w:r>
-        <w:t>•  Test specification and execution</w:t>
-      </w:r>
-    </w:p>
-    <w:p>
-      <w:pPr>
-        <w:pStyle w:val="ListParagraph"/>
-      </w:pPr>
-      <w:r/>
-      <w:r>
-        <w:t>•  Supplier technical coordination</w:t>
-      </w:r>
-    </w:p>
-    <w:p>
-      <w:pPr>
-        <w:pStyle w:val="ListParagraph"/>
-      </w:pPr>
-      <w:r/>
-      <w:r>
-        <w:t>•  Documentation and technical reporting</w:t>
-      </w:r>
-    </w:p>
-    <w:p>
-      <w:pPr>
-        <w:pStyle w:val="Heading2"/>
-      </w:pPr>
-      <w:r>
-        <w:t>Scope of Quality</w:t>
-      </w:r>
-    </w:p>
-    <w:p>
-      <w:r>
-        <w:t>Responsible for compliance and certification:</w:t>
-      </w:r>
-    </w:p>
-    <w:p>
-      <w:pPr>
-        <w:pStyle w:val="ListParagraph"/>
-      </w:pPr>
-      <w:r/>
-      <w:r>
-        <w:t>•  CE technical file preparation and verification</w:t>
-      </w:r>
-    </w:p>
-    <w:p>
-      <w:pPr>
-        <w:pStyle w:val="ListParagraph"/>
-      </w:pPr>
-      <w:r/>
-      <w:r>
-        <w:t>•  IEC 61439 / NEN 1010 compliance verification</w:t>
-      </w:r>
-    </w:p>
-    <w:p>
-      <w:pPr>
-        <w:pStyle w:val="ListParagraph"/>
-      </w:pPr>
-      <w:r/>
-      <w:r>
-        <w:t>•  Safety assessment and documentation</w:t>
-      </w:r>
-    </w:p>
-    <w:p>
-      <w:pPr>
-        <w:pStyle w:val="Heading2"/>
-      </w:pPr>
-      <w:r>
-        <w:t>Scope of operations and procurement</w:t>
-      </w:r>
-    </w:p>
-    <w:p>
-      <w:r>
-        <w:t>Responsible for sourcing, assembly and production readiness:</w:t>
-      </w:r>
-    </w:p>
-    <w:p>
-      <w:pPr>
-        <w:pStyle w:val="ListParagraph"/>
-      </w:pPr>
-      <w:r/>
-      <w:r>
-        <w:t>•  Procurement of power electronics, Powerlock set and cooling components</w:t>
-      </w:r>
-    </w:p>
-    <w:p>
-      <w:pPr>
-        <w:pStyle w:val="ListParagraph"/>
-      </w:pPr>
-      <w:r/>
-      <w:r>
-        <w:t>•  Supplier coordination and lead-time tracking</w:t>
-      </w:r>
-    </w:p>
-    <w:p>
-      <w:pPr>
-        <w:pStyle w:val="ListParagraph"/>
-      </w:pPr>
-      <w:r/>
-      <w:r>
-        <w:t>•  Prototype assembly support and workshop preparation</w:t>
-      </w:r>
-    </w:p>
-    <w:p>
-      <w:pPr>
-        <w:pStyle w:val="ListParagraph"/>
-      </w:pPr>
-      <w:r/>
-      <w:r>
-        <w:t>•  Preparation for series production transfer</w:t>
-      </w:r>
-    </w:p>
-    <w:p>
-      <w:pPr>
-        <w:pStyle w:val="Heading2"/>
-      </w:pPr>
-      <w:r>
-        <w:t>Communication</w:t>
-      </w:r>
-    </w:p>
-    <w:p>
-      <w:r>
-        <w:t>Communication is structured to support fast execution with minimal overhead:</w:t>
-      </w:r>
-    </w:p>
-    <w:p>
-      <w:pPr>
-        <w:pStyle w:val="ListParagraph"/>
-      </w:pPr>
-      <w:r/>
-      <w:r>
-        <w:t>•  Daily informal alignment within the engineering team</w:t>
-      </w:r>
-    </w:p>
-    <w:p>
-      <w:pPr>
-        <w:pStyle w:val="ListParagraph"/>
-      </w:pPr>
-      <w:r/>
-      <w:r>
-        <w:t>•  Weekly project update meeting with all involved engineers</w:t>
-      </w:r>
-    </w:p>
-    <w:p>
-      <w:pPr>
-        <w:pStyle w:val="ListParagraph"/>
-      </w:pPr>
-      <w:r/>
-      <w:r>
-        <w:t>•  Bi-weekly engineering management progress review</w:t>
-      </w:r>
-    </w:p>
-    <w:p>
-      <w:pPr>
-        <w:pStyle w:val="ListParagraph"/>
-      </w:pPr>
-      <w:r/>
-      <w:r>
-        <w:t>•  Formal tollgate review after every TRL milestone</w:t>
-      </w:r>
-    </w:p>
-    <w:p>
-      <w:pPr>
-        <w:pStyle w:val="ListParagraph"/>
-      </w:pPr>
-      <w:r/>
-      <w:r>
-        <w:t>•  Action tracking in GitHub planning</w:t>
+        <w:t>Departments and Communication</w:t>
+      </w:r>
+    </w:p>
+    <w:p>
+      <w:pPr>
+        <w:pStyle w:val="ListParagraph"/>
+      </w:pPr>
+      <w:r>
+        <w:t>•  Engineering – electrical and mechanical design, e-PU10 software integration, test specification and execution, supplier coordination, documentation</w:t>
+      </w:r>
+    </w:p>
+    <w:p>
+      <w:pPr>
+        <w:pStyle w:val="ListParagraph"/>
+      </w:pPr>
+      <w:r>
+        <w:t>•  Quality – CE technical file, IEC 61439 / NEN 1010 compliance verification, safety assessment</w:t>
+      </w:r>
+    </w:p>
+    <w:p>
+      <w:pPr>
+        <w:pStyle w:val="ListParagraph"/>
+      </w:pPr>
+      <w:r>
+        <w:t>•  Operations &amp; Procurement – sourcing of power electronics, Powerlock and cooling components; supplier and lead-time management; prototype assembly and workshop support; series production transfer</w:t>
+      </w:r>
+    </w:p>
+    <w:p>
+      <w:r>
+        <w:t>Communication: daily informal alignment; weekly project update meeting; bi-weekly management review; formal tollgate review per TRL; actions tracked in GitHub.</w:t>
       </w:r>
     </w:p>
     <w:p>
@@ -2383,62 +1785,51 @@
       </w:r>
     </w:p>
     <w:p>
-      <w:r>
-        <w:t>The product is accepted for release when the following criteria are met:</w:t>
-      </w:r>
-    </w:p>
-    <w:p>
-      <w:pPr>
-        <w:pStyle w:val="ListParagraph"/>
-      </w:pPr>
-      <w:r/>
-      <w:r>
-        <w:t>•  Solution is CE certified and compliant with IEC 61439 and NEN 1010</w:t>
-      </w:r>
-    </w:p>
-    <w:p>
-      <w:pPr>
-        <w:pStyle w:val="ListParagraph"/>
-      </w:pPr>
-      <w:r/>
-      <w:r>
-        <w:t>•  Solution is fail-safe and reliable, with redundancy where applicable</w:t>
-      </w:r>
-    </w:p>
-    <w:p>
-      <w:pPr>
-        <w:pStyle w:val="ListParagraph"/>
-      </w:pPr>
-      <w:r/>
-      <w:r>
-        <w:t>•  100% of rated power can be used continuously under nominal conditions (25 °C)</w:t>
-      </w:r>
-    </w:p>
-    <w:p>
-      <w:pPr>
-        <w:pStyle w:val="ListParagraph"/>
-      </w:pPr>
-      <w:r/>
-      <w:r>
-        <w:t>•  Easy to maintain (hot-swappable as a nice-to-have)</w:t>
-      </w:r>
-    </w:p>
-    <w:p>
-      <w:pPr>
-        <w:pStyle w:val="ListParagraph"/>
-      </w:pPr>
-      <w:r/>
-      <w:r>
-        <w:t>•  All stated mandatory technical specifications are validated by test</w:t>
-      </w:r>
-    </w:p>
-    <w:p>
-      <w:pPr>
-        <w:pStyle w:val="ListParagraph"/>
-      </w:pPr>
-      <w:r/>
-      <w:r>
-        <w:t>•  Complete documentation set (build book, CE file, manuals, sales one-pager) is released</w:t>
+      <w:pPr>
+        <w:pStyle w:val="ListParagraph"/>
+      </w:pPr>
+      <w:r>
+        <w:t>•  CE certified and compliant with IEC 61439 and NEN 1010</w:t>
+      </w:r>
+    </w:p>
+    <w:p>
+      <w:pPr>
+        <w:pStyle w:val="ListParagraph"/>
+      </w:pPr>
+      <w:r>
+        <w:t>•  Fail-safe and reliable, with redundancy where applicable</w:t>
+      </w:r>
+    </w:p>
+    <w:p>
+      <w:pPr>
+        <w:pStyle w:val="ListParagraph"/>
+      </w:pPr>
+      <w:r>
+        <w:t>•  100% rated power continuously available at 25 °C</w:t>
+      </w:r>
+    </w:p>
+    <w:p>
+      <w:pPr>
+        <w:pStyle w:val="ListParagraph"/>
+      </w:pPr>
+      <w:r>
+        <w:t>•  Easy to maintain (hot-swappable as nice-to-have)</w:t>
+      </w:r>
+    </w:p>
+    <w:p>
+      <w:pPr>
+        <w:pStyle w:val="ListParagraph"/>
+      </w:pPr>
+      <w:r>
+        <w:t>•  All mandatory technical specifications validated by test</w:t>
+      </w:r>
+    </w:p>
+    <w:p>
+      <w:pPr>
+        <w:pStyle w:val="ListParagraph"/>
+      </w:pPr>
+      <w:r>
+        <w:t>•  Complete documentation set released (build book, CE file, manuals, sales one-pager)</w:t>
       </w:r>
     </w:p>
     <w:p>
@@ -2446,23 +1837,26 @@
         <w:pStyle w:val="Heading1"/>
       </w:pPr>
       <w:r>
-        <w:t>Dependencies</w:t>
-      </w:r>
-    </w:p>
-    <w:p>
-      <w:pPr>
-        <w:pStyle w:val="ListParagraph"/>
-      </w:pPr>
-      <w:r/>
-      <w:r>
-        <w:t>•  e-PU10V2 development (mechanical envelope, control interface, thermal interface)</w:t>
-      </w:r>
-    </w:p>
-    <w:p>
-      <w:pPr>
-        <w:pStyle w:val="ListParagraph"/>
-      </w:pPr>
-      <w:r/>
+        <w:t>Dependencies and Assumptions</w:t>
+      </w:r>
+    </w:p>
+    <w:p>
+      <w:r>
+        <w:t>Dependencies:</w:t>
+      </w:r>
+    </w:p>
+    <w:p>
+      <w:pPr>
+        <w:pStyle w:val="ListParagraph"/>
+      </w:pPr>
+      <w:r>
+        <w:t>•  e-PU10V2 development (mechanical envelope, control and thermal interfaces)</w:t>
+      </w:r>
+    </w:p>
+    <w:p>
+      <w:pPr>
+        <w:pStyle w:val="ListParagraph"/>
+      </w:pPr>
       <w:r>
         <w:t>•  Availability of an e-PU10 test platform during TRL 6</w:t>
       </w:r>
@@ -2471,139 +1865,68 @@
       <w:pPr>
         <w:pStyle w:val="ListParagraph"/>
       </w:pPr>
-      <w:r/>
       <w:r>
         <w:t>•  Supplier lead times for isolated AC/DC modules and Powerlock connectors</w:t>
       </w:r>
     </w:p>
     <w:p>
+      <w:r>
+        <w:t>Assumptions:</w:t>
+      </w:r>
+    </w:p>
+    <w:p>
+      <w:pPr>
+        <w:pStyle w:val="ListParagraph"/>
+      </w:pPr>
+      <w:r>
+        <w:t>•  e-PU10V2 mechanical and control interfaces frozen before TRL 4/5</w:t>
+      </w:r>
+    </w:p>
+    <w:p>
+      <w:pPr>
+        <w:pStyle w:val="ListParagraph"/>
+      </w:pPr>
+      <w:r>
+        <w:t>•  Suitable 400A isolated AC/DC modules available within cost target</w:t>
+      </w:r>
+    </w:p>
+    <w:p>
+      <w:pPr>
+        <w:pStyle w:val="ListParagraph"/>
+      </w:pPr>
+      <w:r>
+        <w:t>•  Existing e-PU10 liquid cooling capacity sufficient for the additional heat load</w:t>
+      </w:r>
+    </w:p>
+    <w:p>
+      <w:pPr>
+        <w:pStyle w:val="ListParagraph"/>
+      </w:pPr>
+      <w:r>
+        <w:t>•  Engineering capacity available across all required disciplines per plan</w:t>
+      </w:r>
+    </w:p>
+    <w:p>
       <w:pPr>
         <w:pStyle w:val="Heading1"/>
       </w:pPr>
       <w:r>
-        <w:t>Assumptions</w:t>
-      </w:r>
-    </w:p>
-    <w:p>
-      <w:pPr>
-        <w:pStyle w:val="ListParagraph"/>
-      </w:pPr>
-      <w:r/>
-      <w:r>
-        <w:t>•  The e-PU10V2 mechanical and control interfaces are frozen before the start of TRL 4/5</w:t>
-      </w:r>
-    </w:p>
-    <w:p>
-      <w:pPr>
-        <w:pStyle w:val="ListParagraph"/>
-      </w:pPr>
-      <w:r/>
-      <w:r>
-        <w:t>•  Suitable 400A isolated AC/DC modules are commercially available within the material-cost target</w:t>
-      </w:r>
-    </w:p>
-    <w:p>
-      <w:pPr>
-        <w:pStyle w:val="ListParagraph"/>
-      </w:pPr>
-      <w:r/>
-      <w:r>
-        <w:t>•  Existing e-PU10 liquid cooling capacity is sufficient for the additional charger heat load</w:t>
-      </w:r>
-    </w:p>
-    <w:p>
-      <w:pPr>
-        <w:pStyle w:val="ListParagraph"/>
-      </w:pPr>
-      <w:r/>
-      <w:r>
-        <w:t>•  Engineering capacity across the disciplines listed above is available according to plan</w:t>
-      </w:r>
-    </w:p>
-    <w:p>
-      <w:pPr>
-        <w:pStyle w:val="Heading1"/>
-      </w:pPr>
-      <w:r>
-        <w:t>Tollgate review and accreditation</w:t>
-      </w:r>
-    </w:p>
-    <w:p>
-      <w:r>
-        <w:t>After completion of each TRL phase a formal tollgate review is performed to assess technical maturity, compliance with requirements and readiness to proceed to the next stage. The review is based on objective evidence from test results, design documentation and subsystem validation, and confirms that all mandatory deliverables for the respective phase have been completed.</w:t>
-      </w:r>
-    </w:p>
-    <w:p>
-      <w:r>
-        <w:t>Key assessment criteria:</w:t>
-      </w:r>
-    </w:p>
-    <w:p>
-      <w:pPr>
-        <w:pStyle w:val="ListParagraph"/>
-      </w:pPr>
-      <w:r/>
-      <w:r>
-        <w:t>•  Completion of TRL-specific deliverables as defined in this project plan</w:t>
-      </w:r>
-    </w:p>
-    <w:p>
-      <w:pPr>
-        <w:pStyle w:val="ListParagraph"/>
-      </w:pPr>
-      <w:r/>
-      <w:r>
-        <w:t>•  Successful implementation and verification of key system functions relevant for the TRL phase</w:t>
-      </w:r>
-    </w:p>
-    <w:p>
-      <w:pPr>
-        <w:pStyle w:val="ListParagraph"/>
-      </w:pPr>
-      <w:r/>
-      <w:r>
-        <w:t>•  Resolution of critical technical issues identified during the previous phase</w:t>
-      </w:r>
-    </w:p>
-    <w:p>
-      <w:pPr>
-        <w:pStyle w:val="ListParagraph"/>
-      </w:pPr>
-      <w:r/>
-      <w:r>
-        <w:t>•  Completion of required test activities and documentation updates</w:t>
-      </w:r>
-    </w:p>
-    <w:p>
-      <w:r>
-        <w:t>Each tollgate concludes with one of the following outcomes:</w:t>
-      </w:r>
-    </w:p>
-    <w:p>
-      <w:pPr>
-        <w:pStyle w:val="ListParagraph"/>
-      </w:pPr>
-      <w:r/>
-      <w:r>
-        <w:t>•  Approved – TRL phase completed and project may proceed to the next TRL</w:t>
-      </w:r>
-    </w:p>
-    <w:p>
-      <w:pPr>
-        <w:pStyle w:val="ListParagraph"/>
-      </w:pPr>
-      <w:r/>
-      <w:r>
-        <w:t>•  Approved with actions – TRL completed with non-blocking open items, tracked and documented</w:t>
-      </w:r>
-    </w:p>
-    <w:p>
-      <w:pPr>
-        <w:pStyle w:val="ListParagraph"/>
-      </w:pPr>
-      <w:r/>
-      <w:r>
-        <w:t>•  Not approved – TRL criteria are not met, additional work required before continuation</w:t>
+        <w:t>Tollgate Review and Accreditation</w:t>
+      </w:r>
+    </w:p>
+    <w:p>
+      <w:r>
+        <w:t>Each TRL phase ends with a formal tollgate review of technical maturity, requirement compliance and readiness to proceed, based on objective evidence (test results, design documentation, subsystem validation).</w:t>
+      </w:r>
+    </w:p>
+    <w:p>
+      <w:r>
+        <w:t>Assessment criteria: completion of TRL-specific deliverables; verification of key system functions for the phase; resolution of critical issues from the previous phase; completion of required tests and documentation updates.</w:t>
+      </w:r>
+    </w:p>
+    <w:p>
+      <w:r>
+        <w:t>Outcomes: Approved (proceed); Approved with actions (proceed with tracked non-blocking items); Not approved (additional work required).</w:t>
       </w:r>
     </w:p>
     <w:sectPr>

</xml_diff>